<commit_message>
2.160.0 Live: afspraak-editor via de live-laag, tellers opruimen
- afspraak.js ververst op p13:live-wijziging (terugval: interval zonder live-laag)
- live_opruimen() in de kwartiertaak, live_versie mee bij AVG-wissen en in anonimiseer_testkopie
- Verwerkingsregister en runbook bijgewerkt
</commit_message>
<xml_diff>
--- a/docs/handleiding/word/runbook_systeembeheer.docx
+++ b/docs/handleiding/word/runbook_systeembeheer.docx
@@ -4318,7 +4318,44 @@
         <w:rPr>
           <w:lang w:val="nl"/>
         </w:rPr>
-        <w:t xml:space="preserve">tellen niet als activiteit voor het uitloggen na twee uur.</w:t>
+        <w:t xml:space="preserve">tellen niet als activiteit voor het uitloggen na twee uur. De afspraak-editor in het TW-gesprek</w:t>
+      </w:r>
+      <w:r>
+        <w:rPr>
+          <w:lang w:val="nl"/>
+        </w:rPr>
+        <w:t xml:space="preserve"> </w:t>
+      </w:r>
+      <w:r>
+        <w:rPr>
+          <w:lang w:val="nl"/>
+        </w:rPr>
+        <w:t xml:space="preserve">vraagt zijn stand alleen nog op na zo'n signaal (geen eigen 15-secondenvraag meer). Tellers die</w:t>
+      </w:r>
+      <w:r>
+        <w:rPr>
+          <w:lang w:val="nl"/>
+        </w:rPr>
+        <w:t xml:space="preserve"> </w:t>
+      </w:r>
+      <w:r>
+        <w:rPr>
+          <w:lang w:val="nl"/>
+        </w:rPr>
+        <w:t xml:space="preserve">een week stillagen, ruimt de kwartiertaak op (</w:t>
+      </w:r>
+      <w:r>
+        <w:rPr>
+          <w:rStyle w:val="VerbatimChar"/>
+          <w:lang w:val="nl"/>
+        </w:rPr>
+        <w:t xml:space="preserve">live_opruimen()</w:t>
+      </w:r>
+      <w:r>
+        <w:rPr>
+          <w:lang w:val="nl"/>
+        </w:rPr>
+        <w:t xml:space="preserve">).</w:t>
       </w:r>
     </w:p>
     <w:p>

</xml_diff>